<commit_message>
Adding new cv template
</commit_message>
<xml_diff>
--- a/Default Template - Senior Software Engineer - Yaroslav Bondar.docx
+++ b/Default Template - Senior Software Engineer - Yaroslav Bondar.docx
@@ -32,7 +32,7 @@
         <w:rPr>
           <w:rtl w:val="0"/>
         </w:rPr>
-        <w:t xml:space="preserve">Valencia, Spain | +34 641 290 799 | </w:t>
+        <w:t xml:space="preserve">Valencia, Spain | {phone}} | </w:t>
       </w:r>
       <w:hyperlink r:id="rId7">
         <w:r>
@@ -85,7 +85,7 @@
         <w:rPr>
           <w:rtl w:val="0"/>
         </w:rPr>
-        <w:t xml:space="preserve">{{01_professional_summary}}</w:t>
+        <w:t xml:space="preserve">{{section_professional_summary}}</w:t>
       </w:r>
       <w:r>
         <w:pict>
@@ -180,18 +180,15 @@
     </w:p>
     <w:p>
       <w:pPr>
-        <w:numPr>
-          <w:ilvl w:val="0"/>
-          <w:numId w:val="1"/>
-        </w:numPr>
         <w:spacing w:line="240" w:lineRule="auto"/>
-        <w:ind w:left="360"/>
+        <w:ind w:left="0" w:firstLine="0"/>
+        <w:rPr/>
       </w:pPr>
       <w:r>
         <w:rPr>
           <w:rtl w:val="0"/>
         </w:rPr>
-        <w:t xml:space="preserve">{{04_work_experience_3}}</w:t>
+        <w:t xml:space="preserve">{{section_experience_3_latest}}</w:t>
       </w:r>
       <w:r>
         <w:rPr>
@@ -235,12 +232,8 @@
     </w:p>
     <w:p>
       <w:pPr>
-        <w:numPr>
-          <w:ilvl w:val="0"/>
-          <w:numId w:val="1"/>
-        </w:numPr>
         <w:spacing w:line="240" w:lineRule="auto"/>
-        <w:ind w:left="360"/>
+        <w:ind w:left="0" w:firstLine="0"/>
         <w:rPr>
           <w:rFonts w:ascii="Calibri" w:cs="Calibri" w:eastAsia="Calibri" w:hAnsi="Calibri"/>
         </w:rPr>
@@ -249,7 +242,7 @@
         <w:rPr>
           <w:rtl w:val="0"/>
         </w:rPr>
-        <w:t xml:space="preserve">{{02_work_experience_1}}</w:t>
+        <w:t xml:space="preserve">{{section_experience_2}}</w:t>
       </w:r>
       <w:r>
         <w:rPr>
@@ -287,12 +280,7 @@
     </w:p>
     <w:p>
       <w:pPr>
-        <w:numPr>
-          <w:ilvl w:val="0"/>
-          <w:numId w:val="1"/>
-        </w:numPr>
         <w:spacing w:line="240" w:lineRule="auto"/>
-        <w:ind w:left="360"/>
         <w:rPr>
           <w:rFonts w:ascii="Calibri" w:cs="Calibri" w:eastAsia="Calibri" w:hAnsi="Calibri"/>
         </w:rPr>
@@ -301,7 +289,7 @@
         <w:rPr>
           <w:rtl w:val="0"/>
         </w:rPr>
-        <w:t xml:space="preserve">{{03_work_experience_2}}</w:t>
+        <w:t xml:space="preserve">{{section_experience_1}}</w:t>
       </w:r>
       <w:r>
         <w:rPr>
@@ -480,7 +468,7 @@
         <w:rPr>
           <w:rtl w:val="0"/>
         </w:rPr>
-        <w:t xml:space="preserve">{{05_skills_alignment}}</w:t>
+        <w:t xml:space="preserve">{{section_skills_alignment}}</w:t>
       </w:r>
     </w:p>
     <w:sectPr>
@@ -493,105 +481,7 @@
 </file>
 
 <file path=word/numbering.xml><?xml version="1.0" encoding="utf-8"?>
-<w:numbering xmlns:mc="http://schemas.openxmlformats.org/markup-compatibility/2006" xmlns:o="urn:schemas-microsoft-com:office:office" xmlns:r="http://schemas.openxmlformats.org/officeDocument/2006/relationships" xmlns:m="http://schemas.openxmlformats.org/officeDocument/2006/math" xmlns:v="urn:schemas-microsoft-com:vml" xmlns:wp="http://schemas.openxmlformats.org/drawingml/2006/wordprocessingDrawing" xmlns:w10="urn:schemas-microsoft-com:office:word" xmlns:w="http://schemas.openxmlformats.org/wordprocessingml/2006/main" xmlns:wne="http://schemas.microsoft.com/office/word/2006/wordml" xmlns:sl="http://schemas.openxmlformats.org/schemaLibrary/2006/main" xmlns:a="http://schemas.openxmlformats.org/drawingml/2006/main" xmlns:pic="http://schemas.openxmlformats.org/drawingml/2006/picture" xmlns:c="http://schemas.openxmlformats.org/drawingml/2006/chart" xmlns:lc="http://schemas.openxmlformats.org/drawingml/2006/lockedCanvas" xmlns:dgm="http://schemas.openxmlformats.org/drawingml/2006/diagram" xmlns:wps="http://schemas.microsoft.com/office/word/2010/wordprocessingShape" xmlns:wpg="http://schemas.microsoft.com/office/word/2010/wordprocessingGroup" xmlns:w14="http://schemas.microsoft.com/office/word/2010/wordml" xmlns:w15="http://schemas.microsoft.com/office/word/2012/wordml" xmlns:w16="http://schemas.microsoft.com/office/word/2018/wordml" xmlns:w16cex="http://schemas.microsoft.com/office/word/2018/wordml/cex" xmlns:w16cid="http://schemas.microsoft.com/office/word/2016/wordml/cid" xmlns="http://schemas.microsoft.com/office/tasks/2019/documenttasks" xmlns:cr="http://schemas.microsoft.com/office/comments/2020/reactions">
-  <w:abstractNum w:abstractNumId="1">
-    <w:lvl w:ilvl="0">
-      <w:start w:val="1"/>
-      <w:numFmt w:val="bullet"/>
-      <w:lvlText w:val="●"/>
-      <w:lvlJc w:val="left"/>
-      <w:pPr>
-        <w:ind w:left="360" w:hanging="360"/>
-      </w:pPr>
-      <w:rPr>
-        <w:rFonts w:ascii="Noto Sans Symbols" w:cs="Noto Sans Symbols" w:eastAsia="Noto Sans Symbols" w:hAnsi="Noto Sans Symbols"/>
-      </w:rPr>
-    </w:lvl>
-    <w:lvl w:ilvl="1">
-      <w:start w:val="1"/>
-      <w:numFmt w:val="bullet"/>
-      <w:lvlText w:val=""/>
-      <w:lvlJc w:val="left"/>
-      <w:pPr>
-        <w:ind w:left="0" w:firstLine="0"/>
-      </w:pPr>
-      <w:rPr/>
-    </w:lvl>
-    <w:lvl w:ilvl="2">
-      <w:start w:val="1"/>
-      <w:numFmt w:val="bullet"/>
-      <w:lvlText w:val=""/>
-      <w:lvlJc w:val="left"/>
-      <w:pPr>
-        <w:ind w:left="0" w:firstLine="0"/>
-      </w:pPr>
-      <w:rPr/>
-    </w:lvl>
-    <w:lvl w:ilvl="3">
-      <w:start w:val="1"/>
-      <w:numFmt w:val="bullet"/>
-      <w:lvlText w:val=""/>
-      <w:lvlJc w:val="left"/>
-      <w:pPr>
-        <w:ind w:left="0" w:firstLine="0"/>
-      </w:pPr>
-      <w:rPr/>
-    </w:lvl>
-    <w:lvl w:ilvl="4">
-      <w:start w:val="1"/>
-      <w:numFmt w:val="bullet"/>
-      <w:lvlText w:val=""/>
-      <w:lvlJc w:val="left"/>
-      <w:pPr>
-        <w:ind w:left="0" w:firstLine="0"/>
-      </w:pPr>
-      <w:rPr/>
-    </w:lvl>
-    <w:lvl w:ilvl="5">
-      <w:start w:val="1"/>
-      <w:numFmt w:val="bullet"/>
-      <w:lvlText w:val=""/>
-      <w:lvlJc w:val="left"/>
-      <w:pPr>
-        <w:ind w:left="0" w:firstLine="0"/>
-      </w:pPr>
-      <w:rPr/>
-    </w:lvl>
-    <w:lvl w:ilvl="6">
-      <w:start w:val="1"/>
-      <w:numFmt w:val="bullet"/>
-      <w:lvlText w:val=""/>
-      <w:lvlJc w:val="left"/>
-      <w:pPr>
-        <w:ind w:left="0" w:firstLine="0"/>
-      </w:pPr>
-      <w:rPr/>
-    </w:lvl>
-    <w:lvl w:ilvl="7">
-      <w:start w:val="1"/>
-      <w:numFmt w:val="bullet"/>
-      <w:lvlText w:val=""/>
-      <w:lvlJc w:val="left"/>
-      <w:pPr>
-        <w:ind w:left="0" w:firstLine="0"/>
-      </w:pPr>
-      <w:rPr/>
-    </w:lvl>
-    <w:lvl w:ilvl="8">
-      <w:start w:val="1"/>
-      <w:numFmt w:val="bullet"/>
-      <w:lvlText w:val=""/>
-      <w:lvlJc w:val="left"/>
-      <w:pPr>
-        <w:ind w:left="0" w:firstLine="0"/>
-      </w:pPr>
-      <w:rPr/>
-    </w:lvl>
-  </w:abstractNum>
-  <w:num w:numId="1">
-    <w:abstractNumId w:val="1"/>
-  </w:num>
-</w:numbering>
+<w:numbering xmlns:mc="http://schemas.openxmlformats.org/markup-compatibility/2006" xmlns:o="urn:schemas-microsoft-com:office:office" xmlns:r="http://schemas.openxmlformats.org/officeDocument/2006/relationships" xmlns:m="http://schemas.openxmlformats.org/officeDocument/2006/math" xmlns:v="urn:schemas-microsoft-com:vml" xmlns:wp="http://schemas.openxmlformats.org/drawingml/2006/wordprocessingDrawing" xmlns:w10="urn:schemas-microsoft-com:office:word" xmlns:w="http://schemas.openxmlformats.org/wordprocessingml/2006/main" xmlns:wne="http://schemas.microsoft.com/office/word/2006/wordml" xmlns:sl="http://schemas.openxmlformats.org/schemaLibrary/2006/main" xmlns:a="http://schemas.openxmlformats.org/drawingml/2006/main" xmlns:pic="http://schemas.openxmlformats.org/drawingml/2006/picture" xmlns:c="http://schemas.openxmlformats.org/drawingml/2006/chart" xmlns:lc="http://schemas.openxmlformats.org/drawingml/2006/lockedCanvas" xmlns:dgm="http://schemas.openxmlformats.org/drawingml/2006/diagram" xmlns:wps="http://schemas.microsoft.com/office/word/2010/wordprocessingShape" xmlns:wpg="http://schemas.microsoft.com/office/word/2010/wordprocessingGroup" xmlns:w14="http://schemas.microsoft.com/office/word/2010/wordml" xmlns:w15="http://schemas.microsoft.com/office/word/2012/wordml" xmlns:w16="http://schemas.microsoft.com/office/word/2018/wordml" xmlns:w16cex="http://schemas.microsoft.com/office/word/2018/wordml/cex" xmlns:w16cid="http://schemas.microsoft.com/office/word/2016/wordml/cid" xmlns="http://schemas.microsoft.com/office/tasks/2019/documenttasks" xmlns:cr="http://schemas.microsoft.com/office/comments/2020/reactions"/>
 </file>
 
 <file path=word/styles.xml><?xml version="1.0" encoding="utf-8"?>

</xml_diff>